<commit_message>
changed the report to fit the requirements
</commit_message>
<xml_diff>
--- a/Lab_01/Звіт_ЛР1_Функціональне_програмування.docx
+++ b/Lab_01/Звіт_ЛР1_Функціональне_програмування.docx
@@ -122,12 +122,24 @@
       <w:pPr>
         <w:spacing w:after="120" w:line="360" w:lineRule="auto"/>
         <w:jc w:val="center"/>
+        <w:rPr>
+          <w:rFonts w:cs="Times New Roman"/>
+          <w:lang w:val="uk-UA"/>
+        </w:rPr>
       </w:pPr>
+      <w:proofErr w:type="spellStart"/>
       <w:r>
         <w:rPr>
           <w:rFonts w:cs="Times New Roman"/>
         </w:rPr>
-        <w:t xml:space="preserve">Основи </w:t>
+        <w:t>Основи</w:t>
+      </w:r>
+      <w:proofErr w:type="spellEnd"/>
+      <w:r>
+        <w:rPr>
+          <w:rFonts w:cs="Times New Roman"/>
+        </w:rPr>
+        <w:t xml:space="preserve"> </w:t>
       </w:r>
       <w:proofErr w:type="spellStart"/>
       <w:r>
@@ -156,6 +168,43 @@
           <w:rFonts w:cs="Times New Roman"/>
         </w:rPr>
         <w:t xml:space="preserve"> в Python</w:t>
+      </w:r>
+    </w:p>
+    <w:p>
+      <w:pPr>
+        <w:spacing w:after="120" w:line="360" w:lineRule="auto"/>
+        <w:jc w:val="center"/>
+        <w:rPr>
+          <w:lang w:val="uk-UA"/>
+        </w:rPr>
+      </w:pPr>
+      <w:r>
+        <w:rPr>
+          <w:rFonts w:cs="Times New Roman"/>
+          <w:lang w:val="uk-UA"/>
+        </w:rPr>
+        <w:t>Варі</w:t>
+      </w:r>
+      <w:r>
+        <w:rPr>
+          <w:rFonts w:cs="Times New Roman"/>
+          <w:lang w:val="uk-UA"/>
+        </w:rPr>
+        <w:t>а</w:t>
+      </w:r>
+      <w:r>
+        <w:rPr>
+          <w:rFonts w:cs="Times New Roman"/>
+          <w:lang w:val="uk-UA"/>
+        </w:rPr>
+        <w:t>нт</w:t>
+      </w:r>
+      <w:r>
+        <w:rPr>
+          <w:rFonts w:cs="Times New Roman"/>
+          <w:lang w:val="uk-UA"/>
+        </w:rPr>
+        <w:t>: 2</w:t>
       </w:r>
     </w:p>
     <w:p>
@@ -272,7 +321,22 @@
     </w:p>
     <w:p>
       <w:pPr>
-        <w:spacing w:after="1200"/>
+        <w:spacing w:after="120" w:line="360" w:lineRule="auto"/>
+        <w:jc w:val="right"/>
+        <w:rPr>
+          <w:rFonts w:cs="Times New Roman"/>
+          <w:lang w:val="uk-UA"/>
+        </w:rPr>
+      </w:pPr>
+    </w:p>
+    <w:p>
+      <w:pPr>
+        <w:spacing w:after="120" w:line="360" w:lineRule="auto"/>
+        <w:jc w:val="right"/>
+        <w:rPr>
+          <w:rFonts w:cs="Times New Roman"/>
+          <w:lang w:val="uk-UA"/>
+        </w:rPr>
       </w:pPr>
     </w:p>
     <w:p>
@@ -280,11 +344,19 @@
         <w:spacing w:after="120" w:line="360" w:lineRule="auto"/>
         <w:jc w:val="center"/>
       </w:pPr>
+      <w:proofErr w:type="spellStart"/>
       <w:r>
         <w:rPr>
           <w:rFonts w:cs="Times New Roman"/>
         </w:rPr>
-        <w:t>Львів 2026</w:t>
+        <w:t>Львів</w:t>
+      </w:r>
+      <w:proofErr w:type="spellEnd"/>
+      <w:r>
+        <w:rPr>
+          <w:rFonts w:cs="Times New Roman"/>
+        </w:rPr>
+        <w:t xml:space="preserve"> 2026</w:t>
       </w:r>
     </w:p>
     <w:p>
@@ -352,7 +424,49 @@
         <w:rPr>
           <w:rFonts w:cs="Times New Roman"/>
         </w:rPr>
-        <w:t xml:space="preserve">Реалізувати програму для обчислення цін зі знижкою у функціональному стилі. Вхідна колекція не повинна змінюватися. Додати функцію вищого порядку з анотацією typing.Callable та </w:t>
+        <w:t xml:space="preserve">Реалізувати програму для обчислення цін зі знижкою у функціональному стилі. Вхідна колекція не повинна змінюватися. Додати функцію вищого порядку з </w:t>
+      </w:r>
+      <w:proofErr w:type="spellStart"/>
+      <w:r>
+        <w:rPr>
+          <w:rFonts w:cs="Times New Roman"/>
+        </w:rPr>
+        <w:t>анотацією</w:t>
+      </w:r>
+      <w:proofErr w:type="spellEnd"/>
+      <w:r>
+        <w:rPr>
+          <w:rFonts w:cs="Times New Roman"/>
+        </w:rPr>
+        <w:t xml:space="preserve"> </w:t>
+      </w:r>
+      <w:proofErr w:type="spellStart"/>
+      <w:r>
+        <w:rPr>
+          <w:rFonts w:cs="Times New Roman"/>
+        </w:rPr>
+        <w:t>typing.Callable</w:t>
+      </w:r>
+      <w:proofErr w:type="spellEnd"/>
+      <w:r>
+        <w:rPr>
+          <w:rFonts w:cs="Times New Roman"/>
+        </w:rPr>
+        <w:t xml:space="preserve"> </w:t>
+      </w:r>
+      <w:proofErr w:type="spellStart"/>
+      <w:r>
+        <w:rPr>
+          <w:rFonts w:cs="Times New Roman"/>
+        </w:rPr>
+        <w:t>та</w:t>
+      </w:r>
+      <w:proofErr w:type="spellEnd"/>
+      <w:r>
+        <w:rPr>
+          <w:rFonts w:cs="Times New Roman"/>
+        </w:rPr>
+        <w:t xml:space="preserve"> </w:t>
       </w:r>
       <w:proofErr w:type="spellStart"/>
       <w:r>
@@ -494,53 +608,59 @@
           <w:sz w:val="18"/>
         </w:rPr>
         <w:br/>
-        <w:t xml:space="preserve">from typing import </w:t>
-      </w:r>
-      <w:proofErr w:type="spellStart"/>
+      </w:r>
       <w:r>
         <w:rPr>
           <w:rFonts w:ascii="Consolas" w:hAnsi="Consolas" w:cs="Consolas"/>
           <w:sz w:val="18"/>
         </w:rPr>
-        <w:t>TypeVar</w:t>
-      </w:r>
-      <w:proofErr w:type="spellEnd"/>
+        <w:t xml:space="preserve">from typing import </w:t>
+      </w:r>
+      <w:proofErr w:type="spellStart"/>
       <w:r>
         <w:rPr>
           <w:rFonts w:ascii="Consolas" w:hAnsi="Consolas" w:cs="Consolas"/>
           <w:sz w:val="18"/>
         </w:rPr>
-        <w:br/>
-      </w:r>
+        <w:t>TypeVar</w:t>
+      </w:r>
+      <w:proofErr w:type="spellEnd"/>
       <w:r>
         <w:rPr>
           <w:rFonts w:ascii="Consolas" w:hAnsi="Consolas" w:cs="Consolas"/>
           <w:sz w:val="18"/>
         </w:rPr>
         <w:br/>
-        <w:t xml:space="preserve">T = </w:t>
-      </w:r>
-      <w:proofErr w:type="spellStart"/>
+      </w:r>
       <w:r>
         <w:rPr>
           <w:rFonts w:ascii="Consolas" w:hAnsi="Consolas" w:cs="Consolas"/>
           <w:sz w:val="18"/>
         </w:rPr>
-        <w:t>TypeVar</w:t>
-      </w:r>
-      <w:proofErr w:type="spellEnd"/>
+        <w:br/>
+        <w:t xml:space="preserve">T = </w:t>
+      </w:r>
+      <w:proofErr w:type="spellStart"/>
       <w:r>
         <w:rPr>
           <w:rFonts w:ascii="Consolas" w:hAnsi="Consolas" w:cs="Consolas"/>
           <w:sz w:val="18"/>
         </w:rPr>
-        <w:t>("T")</w:t>
-      </w:r>
+        <w:t>TypeVar</w:t>
+      </w:r>
+      <w:proofErr w:type="spellEnd"/>
       <w:r>
         <w:rPr>
           <w:rFonts w:ascii="Consolas" w:hAnsi="Consolas" w:cs="Consolas"/>
           <w:sz w:val="18"/>
         </w:rPr>
+        <w:t>("T")</w:t>
+      </w:r>
+      <w:r>
+        <w:rPr>
+          <w:rFonts w:ascii="Consolas" w:hAnsi="Consolas" w:cs="Consolas"/>
+          <w:sz w:val="18"/>
+        </w:rPr>
         <w:br/>
         <w:t xml:space="preserve">R = </w:t>
       </w:r>
@@ -675,6 +795,12 @@
           <w:sz w:val="18"/>
         </w:rPr>
         <w:br/>
+      </w:r>
+      <w:r>
+        <w:rPr>
+          <w:rFonts w:ascii="Consolas" w:hAnsi="Consolas" w:cs="Consolas"/>
+          <w:sz w:val="18"/>
+        </w:rPr>
         <w:t>def calculate_total(prices: Iterable[Decimal]) -&gt; Decimal:</w:t>
       </w:r>
       <w:r>
@@ -2656,6 +2782,7 @@
   <w:style w:type="character" w:default="1" w:styleId="a2">
     <w:name w:val="Default Paragraph Font"/>
     <w:uiPriority w:val="1"/>
+    <w:semiHidden/>
     <w:unhideWhenUsed/>
   </w:style>
   <w:style w:type="table" w:default="1" w:styleId="a3">
@@ -13765,4 +13892,10 @@
     <ds:schemaRef ds:uri="http://schemas.openxmlformats.org/officeDocument/2006/bibliography"/>
   </ds:schemaRefs>
 </ds:datastoreItem>
+</file>
+
+<file path=docMetadata/LabelInfo.xml><?xml version="1.0" encoding="utf-8"?>
+<clbl:labelList xmlns:clbl="http://schemas.microsoft.com/office/2020/mipLabelMetadata">
+  <clbl:label id="{70a28522-969b-451f-bdb2-abfea3aaa5bf}" enabled="0" method="" siteId="{70a28522-969b-451f-bdb2-abfea3aaa5bf}" removed="1"/>
+</clbl:labelList>
 </file>
</xml_diff>